<commit_message>
Actualiza reporte de trabajo en equipo con las tareas pendientes de Andres para la Entrega 3
</commit_message>
<xml_diff>
--- a/Entregas/Entrega 3/Entregas a Enviar/Reporte_Trabajo_Equipo_E3.docx
+++ b/Entregas/Entrega 3/Entregas a Enviar/Reporte_Trabajo_Equipo_E3.docx
@@ -775,6 +775,332 @@
                 <w:b/>
                 <w:bCs/>
               </w:rPr>
+              <w:t xml:space="preserve">API — endpoint de metadatos</w:t>
+            </w:r>
+          </w:p>
+        </w:tc>
+        <w:tc>
+          <w:tcPr/>
+          <w:p>
+            <w:pPr>
+              <w:pStyle w:val="Compact"/>
+            </w:pPr>
+            <w:r>
+              <w:rPr>
+                <w:i/>
+                <w:iCs/>
+              </w:rPr>
+              <w:t xml:space="preserve">(Pendiente de ejecutar: agrega</w:t>
+            </w:r>
+            <w:r>
+              <w:rPr>
+                <w:i/>
+                <w:iCs/>
+              </w:rPr>
+              <w:t xml:space="preserve"> </w:t>
+            </w:r>
+            <w:r>
+              <w:rPr>
+                <w:rStyle w:val="VerbatimChar"/>
+                <w:i/>
+                <w:iCs/>
+              </w:rPr>
+              <w:t xml:space="preserve">GET /api/v1/model-info</w:t>
+            </w:r>
+            <w:r>
+              <w:rPr>
+                <w:i/>
+                <w:iCs/>
+              </w:rPr>
+              <w:t xml:space="preserve"> </w:t>
+            </w:r>
+            <w:r>
+              <w:rPr>
+                <w:i/>
+                <w:iCs/>
+              </w:rPr>
+              <w:t xml:space="preserve">a</w:t>
+            </w:r>
+            <w:r>
+              <w:rPr>
+                <w:i/>
+                <w:iCs/>
+              </w:rPr>
+              <w:t xml:space="preserve"> </w:t>
+            </w:r>
+            <w:r>
+              <w:rPr>
+                <w:rStyle w:val="VerbatimChar"/>
+                <w:i/>
+                <w:iCs/>
+              </w:rPr>
+              <w:t xml:space="preserve">churn-api</w:t>
+            </w:r>
+            <w:r>
+              <w:rPr>
+                <w:i/>
+                <w:iCs/>
+              </w:rPr>
+              <w:t xml:space="preserve"> </w:t>
+            </w:r>
+            <w:r>
+              <w:rPr>
+                <w:i/>
+                <w:iCs/>
+              </w:rPr>
+              <w:t xml:space="preserve">con los hiperparámetros del modelo, según guía enviada)</w:t>
+            </w:r>
+          </w:p>
+        </w:tc>
+        <w:tc>
+          <w:tcPr/>
+          <w:p>
+            <w:pPr>
+              <w:pStyle w:val="Compact"/>
+            </w:pPr>
+            <w:r>
+              <w:t xml:space="preserve">Andrés Rueda</w:t>
+            </w:r>
+          </w:p>
+        </w:tc>
+        <w:tc>
+          <w:tcPr/>
+          <w:p>
+            <w:pPr>
+              <w:pStyle w:val="Compact"/>
+            </w:pPr>
+            <w:r>
+              <w:rPr>
+                <w:i/>
+                <w:iCs/>
+              </w:rPr>
+              <w:t xml:space="preserve">(pendiente — ver</w:t>
+            </w:r>
+            <w:r>
+              <w:rPr>
+                <w:i/>
+                <w:iCs/>
+              </w:rPr>
+              <w:t xml:space="preserve"> </w:t>
+            </w:r>
+            <w:r>
+              <w:rPr>
+                <w:rStyle w:val="VerbatimChar"/>
+                <w:i/>
+                <w:iCs/>
+              </w:rPr>
+              <w:t xml:space="preserve">Guia_Andres_Entrega3.zip</w:t>
+            </w:r>
+            <w:r>
+              <w:rPr>
+                <w:i/>
+                <w:iCs/>
+              </w:rPr>
+              <w:t xml:space="preserve">)</w:t>
+            </w:r>
+          </w:p>
+        </w:tc>
+      </w:tr>
+      <w:tr>
+        <w:tc>
+          <w:tcPr/>
+          <w:p>
+            <w:pPr>
+              <w:pStyle w:val="Compact"/>
+            </w:pPr>
+            <w:r>
+              <w:rPr>
+                <w:b/>
+                <w:bCs/>
+              </w:rPr>
+              <w:t xml:space="preserve">Documentación de arquitectura</w:t>
+            </w:r>
+          </w:p>
+        </w:tc>
+        <w:tc>
+          <w:tcPr/>
+          <w:p>
+            <w:pPr>
+              <w:pStyle w:val="Compact"/>
+            </w:pPr>
+            <w:r>
+              <w:rPr>
+                <w:i/>
+                <w:iCs/>
+              </w:rPr>
+              <w:t xml:space="preserve">(Pendiente de ejecutar: agrega la sección</w:t>
+            </w:r>
+            <w:r>
+              <w:rPr>
+                <w:i/>
+                <w:iCs/>
+              </w:rPr>
+              <w:t xml:space="preserve"> </w:t>
+            </w:r>
+            <w:r>
+              <w:rPr>
+                <w:i/>
+                <w:iCs/>
+              </w:rPr>
+              <w:t xml:space="preserve">“Arquitectura (Entrega 3)”</w:t>
+            </w:r>
+            <w:r>
+              <w:rPr>
+                <w:i/>
+                <w:iCs/>
+              </w:rPr>
+              <w:t xml:space="preserve"> </w:t>
+            </w:r>
+            <w:r>
+              <w:rPr>
+                <w:i/>
+                <w:iCs/>
+              </w:rPr>
+              <w:t xml:space="preserve">al</w:t>
+            </w:r>
+            <w:r>
+              <w:rPr>
+                <w:i/>
+                <w:iCs/>
+              </w:rPr>
+              <w:t xml:space="preserve"> </w:t>
+            </w:r>
+            <w:r>
+              <w:rPr>
+                <w:rStyle w:val="VerbatimChar"/>
+                <w:i/>
+                <w:iCs/>
+              </w:rPr>
+              <w:t xml:space="preserve">README.md</w:t>
+            </w:r>
+            <w:r>
+              <w:rPr>
+                <w:i/>
+                <w:iCs/>
+              </w:rPr>
+              <w:t xml:space="preserve"> </w:t>
+            </w:r>
+            <w:r>
+              <w:rPr>
+                <w:i/>
+                <w:iCs/>
+              </w:rPr>
+              <w:t xml:space="preserve">describiendo</w:t>
+            </w:r>
+            <w:r>
+              <w:rPr>
+                <w:i/>
+                <w:iCs/>
+              </w:rPr>
+              <w:t xml:space="preserve"> </w:t>
+            </w:r>
+            <w:r>
+              <w:rPr>
+                <w:rStyle w:val="VerbatimChar"/>
+                <w:i/>
+                <w:iCs/>
+              </w:rPr>
+              <w:t xml:space="preserve">churn-api</w:t>
+            </w:r>
+            <w:r>
+              <w:rPr>
+                <w:i/>
+                <w:iCs/>
+              </w:rPr>
+              <w:t xml:space="preserve"> </w:t>
+            </w:r>
+            <w:r>
+              <w:rPr>
+                <w:i/>
+                <w:iCs/>
+              </w:rPr>
+              <w:t xml:space="preserve">+</w:t>
+            </w:r>
+            <w:r>
+              <w:rPr>
+                <w:i/>
+                <w:iCs/>
+              </w:rPr>
+              <w:t xml:space="preserve"> </w:t>
+            </w:r>
+            <w:r>
+              <w:rPr>
+                <w:rStyle w:val="VerbatimChar"/>
+                <w:i/>
+                <w:iCs/>
+              </w:rPr>
+              <w:t xml:space="preserve">churn-tablero</w:t>
+            </w:r>
+            <w:r>
+              <w:rPr>
+                <w:i/>
+                <w:iCs/>
+              </w:rPr>
+              <w:t xml:space="preserve">)</w:t>
+            </w:r>
+          </w:p>
+        </w:tc>
+        <w:tc>
+          <w:tcPr/>
+          <w:p>
+            <w:pPr>
+              <w:pStyle w:val="Compact"/>
+            </w:pPr>
+            <w:r>
+              <w:t xml:space="preserve">Andrés Rueda</w:t>
+            </w:r>
+          </w:p>
+        </w:tc>
+        <w:tc>
+          <w:tcPr/>
+          <w:p>
+            <w:pPr>
+              <w:pStyle w:val="Compact"/>
+            </w:pPr>
+            <w:r>
+              <w:rPr>
+                <w:i/>
+                <w:iCs/>
+              </w:rPr>
+              <w:t xml:space="preserve">(pendiente — ver</w:t>
+            </w:r>
+            <w:r>
+              <w:rPr>
+                <w:i/>
+                <w:iCs/>
+              </w:rPr>
+              <w:t xml:space="preserve"> </w:t>
+            </w:r>
+            <w:r>
+              <w:rPr>
+                <w:rStyle w:val="VerbatimChar"/>
+                <w:i/>
+                <w:iCs/>
+              </w:rPr>
+              <w:t xml:space="preserve">Guia_Andres_Entrega3.zip</w:t>
+            </w:r>
+            <w:r>
+              <w:rPr>
+                <w:i/>
+                <w:iCs/>
+              </w:rPr>
+              <w:t xml:space="preserve">)</w:t>
+            </w:r>
+          </w:p>
+        </w:tc>
+      </w:tr>
+      <w:tr>
+        <w:tc>
+          <w:tcPr/>
+          <w:p>
+            <w:pPr>
+              <w:pStyle w:val="Compact"/>
+            </w:pPr>
+            <w:r>
+              <w:rPr>
+                <w:b/>
+                <w:bCs/>
+              </w:rPr>
               <w:t xml:space="preserve">Revisión y retroalimentación</w:t>
             </w:r>
           </w:p>
@@ -895,7 +1221,22 @@
         <w:t xml:space="preserve"> </w:t>
       </w:r>
       <w:r>
-        <w:t xml:space="preserve">las dos filas en negrita deben llenarse coordinando con Andrés — en particular, la retroalimentación a otro grupo debe darla</w:t>
+        <w:t xml:space="preserve">las cuatro filas en negrita deben llenarse coordinando con Andrés. Las dos primeras se resuelven siguiendo</w:t>
+      </w:r>
+      <w:r>
+        <w:t xml:space="preserve"> </w:t>
+      </w:r>
+      <w:r>
+        <w:rPr>
+          <w:rStyle w:val="VerbatimChar"/>
+        </w:rPr>
+        <w:t xml:space="preserve">Guia_Andres_Entrega3.zip</w:t>
+      </w:r>
+      <w:r>
+        <w:t xml:space="preserve"> </w:t>
+      </w:r>
+      <w:r>
+        <w:t xml:space="preserve">(dos commits puntuales, no tediosos) — al recibir su captura de commits, reemplazar el hash en estas filas y en la tabla de commits del reporte principal (sección 7). La retroalimentación a otro grupo debe darla</w:t>
       </w:r>
       <w:r>
         <w:t xml:space="preserve"> </w:t>

</xml_diff>